<commit_message>
Add multi-machine run to report (8.23), deck, case study, host guide, paper; refresh finals
</commit_message>
<xml_diff>
--- a/docs/final/RUDP_Final_Project_Report.docx
+++ b/docs/final/RUDP_Final_Project_Report.docx
@@ -41182,7 +41182,1335 @@
           <w:sz w:val="24"/>
           <w:szCs w:val="24"/>
         </w:rPr>
-        <w:t xml:space="preserve"> It takes less than half of the link on every path (mean shares 24%, 30% and 34%), and TCP keeps 7.4 to 8.8 Mbit/s of the 12 Mbit/s link on the 5G-like path, 2.2 to 2.8 Mbit/s of 6 on the lossy path and 1.4 to 1.9 Mbit/s of 3 on the satellite path. Tuned AIMD is squeezed out much more (5% to 17%), which matches its very low speed when alone. On this evidence the agent is a polite neighbour of kernel TCP, but only because it is slower than TCP: its single-flow goodput is below TCP's on the 5G-like and lossy paths. The earlier worry (Section 8.15) was about sharing with AIMD flows, where it takes about two thirds. Limits: three runs per cell on one laptop, so shares are good to roughly ten points (the TCP-against-TCP control alone ranges from 36% to 59% on the lossy path); the TCP-alone figure on the satellite path (1.13 Mbit/s) is lower than the TCP goodput measured next to RUDP because it includes slow start; one TCP congestion control (CUBIC) and no multi-machine path.</w:t>
+        <w:t xml:space="preserve"> It takes less than half of the link on every path (mean shares 24%, 30% and 34%), and TCP keeps 7.4 to 8.8 Mbit/s of the 12 Mbit/s link on the 5G-like path, 2.2 to 2.8 Mbit/s of 6 on the lossy path and 1.4 to 1.9 Mbit/s of 3 on the satellite path. Tuned AIMD is squeezed out much more (5% to 17%), which matches its very low speed when alone. On this evidence the agent is a polite neighbour of kernel TCP, but only because it is slower than TCP: its single-flow goodput is below TCP's on the 5G-like and lossy paths. The earlier worry (Section 8.15) was about sharing with AIMD flows, where it takes about two thirds. Limits: three runs per cell on one laptop, so shares are good to roughly ten points (the TCP-against-TCP control alone ranges from 36% to 59% on the lossy path); the TCP-alone figure on the satellite path (1.13 Mbit/s) is lower than the TCP goodput measured next to RUDP because it includes slow start; one TCP congestion control (CUBIC) and no multi-machine path (Section 8.23 adds one).</w:t>
+      </w:r>
+    </w:p>
+    <w:p>
+      <w:pPr>
+        <w:pStyle w:val="Heading2"/>
+        <w:keepNext/>
+        <w:spacing w:after="120" w:before="120" w:line="360"/>
+      </w:pPr>
+      <w:r>
+        <w:rPr>
+          <w:rFonts w:ascii="Times New Roman" w:cs="Times New Roman" w:eastAsia="Times New Roman" w:hAnsi="Times New Roman"/>
+          <w:b/>
+          <w:bCs/>
+          <w:sz w:val="24"/>
+          <w:szCs w:val="24"/>
+        </w:rPr>
+        <w:t xml:space="preserve">8.23 A first run between two machines</w:t>
+      </w:r>
+    </w:p>
+    <w:p>
+      <w:pPr>
+        <w:spacing w:after="120" w:line="360"/>
+        <w:jc w:val="both"/>
+      </w:pPr>
+      <w:r>
+        <w:rPr>
+          <w:rFonts w:ascii="Times New Roman" w:cs="Times New Roman" w:eastAsia="Times New Roman" w:hAnsi="Times New Roman"/>
+          <w:sz w:val="24"/>
+          <w:szCs w:val="24"/>
+        </w:rPr>
+        <w:t xml:space="preserve">All earlier tests used one computer. To check that the protocol works between two physical machines, the sender ran on one laptop and the receiver (bin/server, UDP 8888) on another, both on different networks and joined through a Tailscale overlay (multihost_server.sh, multihost_client.sh). Tailscale could not set up a direct connection, so all traffic was relayed through a server in Bangalore: ten pings gave 64.7 / 78.8 / 96.5 ms (minimum / mean / maximum), with no loss. Each repetition sent 4,000 real 512-byte packets (2 MB) with kernel TCP and then with tuned AIMD, CUBIC, the BBR-style controller and the neural agent, five repetitions in 34 minutes (2026-10-11).</w:t>
+      </w:r>
+    </w:p>
+    <w:p>
+      <w:pPr>
+        <w:keepNext/>
+        <w:spacing w:after="80" w:before="120"/>
+        <w:jc w:val="center"/>
+      </w:pPr>
+      <w:r>
+        <w:rPr>
+          <w:rFonts w:ascii="Times New Roman" w:cs="Times New Roman" w:eastAsia="Times New Roman" w:hAnsi="Times New Roman"/>
+          <w:b/>
+          <w:bCs/>
+          <w:sz w:val="24"/>
+          <w:szCs w:val="24"/>
+        </w:rPr>
+        <w:t xml:space="preserve">Table 8z: Completion time (s) of 2 MB between two laptops over a relayed Tailscale path; none = no result within the 300 s limit</w:t>
+      </w:r>
+    </w:p>
+    <w:tbl>
+      <w:tblPr>
+        <w:tblW w:type="dxa" w:w="8026"/>
+        <w:tblBorders>
+          <w:top w:val="single" w:color="auto" w:sz="4"/>
+          <w:left w:val="single" w:color="auto" w:sz="4"/>
+          <w:bottom w:val="single" w:color="auto" w:sz="4"/>
+          <w:right w:val="single" w:color="auto" w:sz="4"/>
+          <w:insideH w:val="single" w:color="auto" w:sz="4"/>
+          <w:insideV w:val="single" w:color="auto" w:sz="4"/>
+        </w:tblBorders>
+      </w:tblPr>
+      <w:tblGrid>
+        <w:gridCol w:w="1100"/>
+        <w:gridCol w:w="1250"/>
+        <w:gridCol w:w="1250"/>
+        <w:gridCol w:w="1250"/>
+        <w:gridCol w:w="1250"/>
+        <w:gridCol w:w="1926"/>
+      </w:tblGrid>
+      <w:tr>
+        <w:trPr>
+          <w:cantSplit/>
+          <w:tblHeader/>
+        </w:trPr>
+        <w:tc>
+          <w:tcPr>
+            <w:tcW w:type="dxa" w:w="1100"/>
+            <w:tcBorders>
+              <w:top w:val="single" w:color="000000" w:sz="4"/>
+              <w:left w:val="single" w:color="000000" w:sz="4"/>
+              <w:bottom w:val="single" w:color="000000" w:sz="4"/>
+              <w:right w:val="single" w:color="000000" w:sz="4"/>
+            </w:tcBorders>
+            <w:shd w:fill="D9D9D9" w:color="auto" w:val="clear"/>
+            <w:tcMar>
+              <w:top w:type="dxa" w:w="60"/>
+              <w:left w:type="dxa" w:w="100"/>
+              <w:bottom w:type="dxa" w:w="60"/>
+              <w:right w:type="dxa" w:w="100"/>
+            </w:tcMar>
+          </w:tcPr>
+          <w:p>
+            <w:pPr>
+              <w:spacing w:line="276"/>
+              <w:jc w:val="left"/>
+            </w:pPr>
+            <w:r>
+              <w:rPr>
+                <w:rFonts w:ascii="Times New Roman" w:cs="Times New Roman" w:eastAsia="Times New Roman" w:hAnsi="Times New Roman"/>
+                <w:b/>
+                <w:bCs/>
+                <w:sz w:val="24"/>
+                <w:szCs w:val="24"/>
+              </w:rPr>
+              <w:t xml:space="preserve">Rep</w:t>
+            </w:r>
+          </w:p>
+        </w:tc>
+        <w:tc>
+          <w:tcPr>
+            <w:tcW w:type="dxa" w:w="1250"/>
+            <w:tcBorders>
+              <w:top w:val="single" w:color="000000" w:sz="4"/>
+              <w:left w:val="single" w:color="000000" w:sz="4"/>
+              <w:bottom w:val="single" w:color="000000" w:sz="4"/>
+              <w:right w:val="single" w:color="000000" w:sz="4"/>
+            </w:tcBorders>
+            <w:shd w:fill="D9D9D9" w:color="auto" w:val="clear"/>
+            <w:tcMar>
+              <w:top w:type="dxa" w:w="60"/>
+              <w:left w:type="dxa" w:w="100"/>
+              <w:bottom w:type="dxa" w:w="60"/>
+              <w:right w:type="dxa" w:w="100"/>
+            </w:tcMar>
+          </w:tcPr>
+          <w:p>
+            <w:pPr>
+              <w:spacing w:line="276"/>
+              <w:jc w:val="left"/>
+            </w:pPr>
+            <w:r>
+              <w:rPr>
+                <w:rFonts w:ascii="Times New Roman" w:cs="Times New Roman" w:eastAsia="Times New Roman" w:hAnsi="Times New Roman"/>
+                <w:b/>
+                <w:bCs/>
+                <w:sz w:val="24"/>
+                <w:szCs w:val="24"/>
+              </w:rPr>
+              <w:t xml:space="preserve">Kernel TCP</w:t>
+            </w:r>
+          </w:p>
+        </w:tc>
+        <w:tc>
+          <w:tcPr>
+            <w:tcW w:type="dxa" w:w="1250"/>
+            <w:tcBorders>
+              <w:top w:val="single" w:color="000000" w:sz="4"/>
+              <w:left w:val="single" w:color="000000" w:sz="4"/>
+              <w:bottom w:val="single" w:color="000000" w:sz="4"/>
+              <w:right w:val="single" w:color="000000" w:sz="4"/>
+            </w:tcBorders>
+            <w:shd w:fill="D9D9D9" w:color="auto" w:val="clear"/>
+            <w:tcMar>
+              <w:top w:type="dxa" w:w="60"/>
+              <w:left w:type="dxa" w:w="100"/>
+              <w:bottom w:type="dxa" w:w="60"/>
+              <w:right w:type="dxa" w:w="100"/>
+            </w:tcMar>
+          </w:tcPr>
+          <w:p>
+            <w:pPr>
+              <w:spacing w:line="276"/>
+              <w:jc w:val="left"/>
+            </w:pPr>
+            <w:r>
+              <w:rPr>
+                <w:rFonts w:ascii="Times New Roman" w:cs="Times New Roman" w:eastAsia="Times New Roman" w:hAnsi="Times New Roman"/>
+                <w:b/>
+                <w:bCs/>
+                <w:sz w:val="24"/>
+                <w:szCs w:val="24"/>
+              </w:rPr>
+              <w:t xml:space="preserve">Tuned AIMD</w:t>
+            </w:r>
+          </w:p>
+        </w:tc>
+        <w:tc>
+          <w:tcPr>
+            <w:tcW w:type="dxa" w:w="1250"/>
+            <w:tcBorders>
+              <w:top w:val="single" w:color="000000" w:sz="4"/>
+              <w:left w:val="single" w:color="000000" w:sz="4"/>
+              <w:bottom w:val="single" w:color="000000" w:sz="4"/>
+              <w:right w:val="single" w:color="000000" w:sz="4"/>
+            </w:tcBorders>
+            <w:shd w:fill="D9D9D9" w:color="auto" w:val="clear"/>
+            <w:tcMar>
+              <w:top w:type="dxa" w:w="60"/>
+              <w:left w:type="dxa" w:w="100"/>
+              <w:bottom w:type="dxa" w:w="60"/>
+              <w:right w:type="dxa" w:w="100"/>
+            </w:tcMar>
+          </w:tcPr>
+          <w:p>
+            <w:pPr>
+              <w:spacing w:line="276"/>
+              <w:jc w:val="left"/>
+            </w:pPr>
+            <w:r>
+              <w:rPr>
+                <w:rFonts w:ascii="Times New Roman" w:cs="Times New Roman" w:eastAsia="Times New Roman" w:hAnsi="Times New Roman"/>
+                <w:b/>
+                <w:bCs/>
+                <w:sz w:val="24"/>
+                <w:szCs w:val="24"/>
+              </w:rPr>
+              <w:t xml:space="preserve">CUBIC</w:t>
+            </w:r>
+          </w:p>
+        </w:tc>
+        <w:tc>
+          <w:tcPr>
+            <w:tcW w:type="dxa" w:w="1250"/>
+            <w:tcBorders>
+              <w:top w:val="single" w:color="000000" w:sz="4"/>
+              <w:left w:val="single" w:color="000000" w:sz="4"/>
+              <w:bottom w:val="single" w:color="000000" w:sz="4"/>
+              <w:right w:val="single" w:color="000000" w:sz="4"/>
+            </w:tcBorders>
+            <w:shd w:fill="D9D9D9" w:color="auto" w:val="clear"/>
+            <w:tcMar>
+              <w:top w:type="dxa" w:w="60"/>
+              <w:left w:type="dxa" w:w="100"/>
+              <w:bottom w:type="dxa" w:w="60"/>
+              <w:right w:type="dxa" w:w="100"/>
+            </w:tcMar>
+          </w:tcPr>
+          <w:p>
+            <w:pPr>
+              <w:spacing w:line="276"/>
+              <w:jc w:val="left"/>
+            </w:pPr>
+            <w:r>
+              <w:rPr>
+                <w:rFonts w:ascii="Times New Roman" w:cs="Times New Roman" w:eastAsia="Times New Roman" w:hAnsi="Times New Roman"/>
+                <w:b/>
+                <w:bCs/>
+                <w:sz w:val="24"/>
+                <w:szCs w:val="24"/>
+              </w:rPr>
+              <w:t xml:space="preserve">BBR-style</w:t>
+            </w:r>
+          </w:p>
+        </w:tc>
+        <w:tc>
+          <w:tcPr>
+            <w:tcW w:type="dxa" w:w="1926"/>
+            <w:tcBorders>
+              <w:top w:val="single" w:color="000000" w:sz="4"/>
+              <w:left w:val="single" w:color="000000" w:sz="4"/>
+              <w:bottom w:val="single" w:color="000000" w:sz="4"/>
+              <w:right w:val="single" w:color="000000" w:sz="4"/>
+            </w:tcBorders>
+            <w:shd w:fill="D9D9D9" w:color="auto" w:val="clear"/>
+            <w:tcMar>
+              <w:top w:type="dxa" w:w="60"/>
+              <w:left w:type="dxa" w:w="100"/>
+              <w:bottom w:type="dxa" w:w="60"/>
+              <w:right w:type="dxa" w:w="100"/>
+            </w:tcMar>
+          </w:tcPr>
+          <w:p>
+            <w:pPr>
+              <w:spacing w:line="276"/>
+              <w:jc w:val="left"/>
+            </w:pPr>
+            <w:r>
+              <w:rPr>
+                <w:rFonts w:ascii="Times New Roman" w:cs="Times New Roman" w:eastAsia="Times New Roman" w:hAnsi="Times New Roman"/>
+                <w:b/>
+                <w:bCs/>
+                <w:sz w:val="24"/>
+                <w:szCs w:val="24"/>
+              </w:rPr>
+              <w:t xml:space="preserve">Neural</w:t>
+            </w:r>
+          </w:p>
+        </w:tc>
+      </w:tr>
+      <w:tr>
+        <w:trPr>
+          <w:cantSplit/>
+          <w:tblHeader w:val="false"/>
+        </w:trPr>
+        <w:tc>
+          <w:tcPr>
+            <w:tcW w:type="dxa" w:w="1100"/>
+            <w:tcBorders>
+              <w:top w:val="single" w:color="000000" w:sz="4"/>
+              <w:left w:val="single" w:color="000000" w:sz="4"/>
+              <w:bottom w:val="single" w:color="000000" w:sz="4"/>
+              <w:right w:val="single" w:color="000000" w:sz="4"/>
+            </w:tcBorders>
+            <w:tcMar>
+              <w:top w:type="dxa" w:w="60"/>
+              <w:left w:type="dxa" w:w="100"/>
+              <w:bottom w:type="dxa" w:w="60"/>
+              <w:right w:type="dxa" w:w="100"/>
+            </w:tcMar>
+          </w:tcPr>
+          <w:p>
+            <w:pPr>
+              <w:spacing w:line="276"/>
+              <w:jc w:val="left"/>
+            </w:pPr>
+            <w:r>
+              <w:rPr>
+                <w:rFonts w:ascii="Times New Roman" w:cs="Times New Roman" w:eastAsia="Times New Roman" w:hAnsi="Times New Roman"/>
+                <w:b w:val="false"/>
+                <w:bCs w:val="false"/>
+                <w:sz w:val="24"/>
+                <w:szCs w:val="24"/>
+              </w:rPr>
+              <w:t xml:space="preserve">1</w:t>
+            </w:r>
+          </w:p>
+        </w:tc>
+        <w:tc>
+          <w:tcPr>
+            <w:tcW w:type="dxa" w:w="1250"/>
+            <w:tcBorders>
+              <w:top w:val="single" w:color="000000" w:sz="4"/>
+              <w:left w:val="single" w:color="000000" w:sz="4"/>
+              <w:bottom w:val="single" w:color="000000" w:sz="4"/>
+              <w:right w:val="single" w:color="000000" w:sz="4"/>
+            </w:tcBorders>
+            <w:tcMar>
+              <w:top w:type="dxa" w:w="60"/>
+              <w:left w:type="dxa" w:w="100"/>
+              <w:bottom w:type="dxa" w:w="60"/>
+              <w:right w:type="dxa" w:w="100"/>
+            </w:tcMar>
+          </w:tcPr>
+          <w:p>
+            <w:pPr>
+              <w:spacing w:line="276"/>
+              <w:jc w:val="left"/>
+            </w:pPr>
+            <w:r>
+              <w:rPr>
+                <w:rFonts w:ascii="Times New Roman" w:cs="Times New Roman" w:eastAsia="Times New Roman" w:hAnsi="Times New Roman"/>
+                <w:b w:val="false"/>
+                <w:bCs w:val="false"/>
+                <w:sz w:val="24"/>
+                <w:szCs w:val="24"/>
+              </w:rPr>
+              <w:t xml:space="preserve">2.47</w:t>
+            </w:r>
+          </w:p>
+        </w:tc>
+        <w:tc>
+          <w:tcPr>
+            <w:tcW w:type="dxa" w:w="1250"/>
+            <w:tcBorders>
+              <w:top w:val="single" w:color="000000" w:sz="4"/>
+              <w:left w:val="single" w:color="000000" w:sz="4"/>
+              <w:bottom w:val="single" w:color="000000" w:sz="4"/>
+              <w:right w:val="single" w:color="000000" w:sz="4"/>
+            </w:tcBorders>
+            <w:tcMar>
+              <w:top w:type="dxa" w:w="60"/>
+              <w:left w:type="dxa" w:w="100"/>
+              <w:bottom w:type="dxa" w:w="60"/>
+              <w:right w:type="dxa" w:w="100"/>
+            </w:tcMar>
+          </w:tcPr>
+          <w:p>
+            <w:pPr>
+              <w:spacing w:line="276"/>
+              <w:jc w:val="left"/>
+            </w:pPr>
+            <w:r>
+              <w:rPr>
+                <w:rFonts w:ascii="Times New Roman" w:cs="Times New Roman" w:eastAsia="Times New Roman" w:hAnsi="Times New Roman"/>
+                <w:b w:val="false"/>
+                <w:bCs w:val="false"/>
+                <w:sz w:val="24"/>
+                <w:szCs w:val="24"/>
+              </w:rPr>
+              <w:t xml:space="preserve">14.23</w:t>
+            </w:r>
+          </w:p>
+        </w:tc>
+        <w:tc>
+          <w:tcPr>
+            <w:tcW w:type="dxa" w:w="1250"/>
+            <w:tcBorders>
+              <w:top w:val="single" w:color="000000" w:sz="4"/>
+              <w:left w:val="single" w:color="000000" w:sz="4"/>
+              <w:bottom w:val="single" w:color="000000" w:sz="4"/>
+              <w:right w:val="single" w:color="000000" w:sz="4"/>
+            </w:tcBorders>
+            <w:tcMar>
+              <w:top w:type="dxa" w:w="60"/>
+              <w:left w:type="dxa" w:w="100"/>
+              <w:bottom w:type="dxa" w:w="60"/>
+              <w:right w:type="dxa" w:w="100"/>
+            </w:tcMar>
+          </w:tcPr>
+          <w:p>
+            <w:pPr>
+              <w:spacing w:line="276"/>
+              <w:jc w:val="left"/>
+            </w:pPr>
+            <w:r>
+              <w:rPr>
+                <w:rFonts w:ascii="Times New Roman" w:cs="Times New Roman" w:eastAsia="Times New Roman" w:hAnsi="Times New Roman"/>
+                <w:b w:val="false"/>
+                <w:bCs w:val="false"/>
+                <w:sz w:val="24"/>
+                <w:szCs w:val="24"/>
+              </w:rPr>
+              <w:t xml:space="preserve">12.44</w:t>
+            </w:r>
+          </w:p>
+        </w:tc>
+        <w:tc>
+          <w:tcPr>
+            <w:tcW w:type="dxa" w:w="1250"/>
+            <w:tcBorders>
+              <w:top w:val="single" w:color="000000" w:sz="4"/>
+              <w:left w:val="single" w:color="000000" w:sz="4"/>
+              <w:bottom w:val="single" w:color="000000" w:sz="4"/>
+              <w:right w:val="single" w:color="000000" w:sz="4"/>
+            </w:tcBorders>
+            <w:tcMar>
+              <w:top w:type="dxa" w:w="60"/>
+              <w:left w:type="dxa" w:w="100"/>
+              <w:bottom w:type="dxa" w:w="60"/>
+              <w:right w:type="dxa" w:w="100"/>
+            </w:tcMar>
+          </w:tcPr>
+          <w:p>
+            <w:pPr>
+              <w:spacing w:line="276"/>
+              <w:jc w:val="left"/>
+            </w:pPr>
+            <w:r>
+              <w:rPr>
+                <w:rFonts w:ascii="Times New Roman" w:cs="Times New Roman" w:eastAsia="Times New Roman" w:hAnsi="Times New Roman"/>
+                <w:b w:val="false"/>
+                <w:bCs w:val="false"/>
+                <w:sz w:val="24"/>
+                <w:szCs w:val="24"/>
+              </w:rPr>
+              <w:t xml:space="preserve">6.35</w:t>
+            </w:r>
+          </w:p>
+        </w:tc>
+        <w:tc>
+          <w:tcPr>
+            <w:tcW w:type="dxa" w:w="1926"/>
+            <w:tcBorders>
+              <w:top w:val="single" w:color="000000" w:sz="4"/>
+              <w:left w:val="single" w:color="000000" w:sz="4"/>
+              <w:bottom w:val="single" w:color="000000" w:sz="4"/>
+              <w:right w:val="single" w:color="000000" w:sz="4"/>
+            </w:tcBorders>
+            <w:tcMar>
+              <w:top w:type="dxa" w:w="60"/>
+              <w:left w:type="dxa" w:w="100"/>
+              <w:bottom w:type="dxa" w:w="60"/>
+              <w:right w:type="dxa" w:w="100"/>
+            </w:tcMar>
+          </w:tcPr>
+          <w:p>
+            <w:pPr>
+              <w:spacing w:line="276"/>
+              <w:jc w:val="left"/>
+            </w:pPr>
+            <w:r>
+              <w:rPr>
+                <w:rFonts w:ascii="Times New Roman" w:cs="Times New Roman" w:eastAsia="Times New Roman" w:hAnsi="Times New Roman"/>
+                <w:b w:val="false"/>
+                <w:bCs w:val="false"/>
+                <w:sz w:val="24"/>
+                <w:szCs w:val="24"/>
+              </w:rPr>
+              <w:t xml:space="preserve">4.70</w:t>
+            </w:r>
+          </w:p>
+        </w:tc>
+      </w:tr>
+      <w:tr>
+        <w:trPr>
+          <w:cantSplit/>
+          <w:tblHeader w:val="false"/>
+        </w:trPr>
+        <w:tc>
+          <w:tcPr>
+            <w:tcW w:type="dxa" w:w="1100"/>
+            <w:tcBorders>
+              <w:top w:val="single" w:color="000000" w:sz="4"/>
+              <w:left w:val="single" w:color="000000" w:sz="4"/>
+              <w:bottom w:val="single" w:color="000000" w:sz="4"/>
+              <w:right w:val="single" w:color="000000" w:sz="4"/>
+            </w:tcBorders>
+            <w:tcMar>
+              <w:top w:type="dxa" w:w="60"/>
+              <w:left w:type="dxa" w:w="100"/>
+              <w:bottom w:type="dxa" w:w="60"/>
+              <w:right w:type="dxa" w:w="100"/>
+            </w:tcMar>
+          </w:tcPr>
+          <w:p>
+            <w:pPr>
+              <w:spacing w:line="276"/>
+              <w:jc w:val="left"/>
+            </w:pPr>
+            <w:r>
+              <w:rPr>
+                <w:rFonts w:ascii="Times New Roman" w:cs="Times New Roman" w:eastAsia="Times New Roman" w:hAnsi="Times New Roman"/>
+                <w:b w:val="false"/>
+                <w:bCs w:val="false"/>
+                <w:sz w:val="24"/>
+                <w:szCs w:val="24"/>
+              </w:rPr>
+              <w:t xml:space="preserve">2</w:t>
+            </w:r>
+          </w:p>
+        </w:tc>
+        <w:tc>
+          <w:tcPr>
+            <w:tcW w:type="dxa" w:w="1250"/>
+            <w:tcBorders>
+              <w:top w:val="single" w:color="000000" w:sz="4"/>
+              <w:left w:val="single" w:color="000000" w:sz="4"/>
+              <w:bottom w:val="single" w:color="000000" w:sz="4"/>
+              <w:right w:val="single" w:color="000000" w:sz="4"/>
+            </w:tcBorders>
+            <w:tcMar>
+              <w:top w:type="dxa" w:w="60"/>
+              <w:left w:type="dxa" w:w="100"/>
+              <w:bottom w:type="dxa" w:w="60"/>
+              <w:right w:type="dxa" w:w="100"/>
+            </w:tcMar>
+          </w:tcPr>
+          <w:p>
+            <w:pPr>
+              <w:spacing w:line="276"/>
+              <w:jc w:val="left"/>
+            </w:pPr>
+            <w:r>
+              <w:rPr>
+                <w:rFonts w:ascii="Times New Roman" w:cs="Times New Roman" w:eastAsia="Times New Roman" w:hAnsi="Times New Roman"/>
+                <w:b w:val="false"/>
+                <w:bCs w:val="false"/>
+                <w:sz w:val="24"/>
+                <w:szCs w:val="24"/>
+              </w:rPr>
+              <w:t xml:space="preserve">2.02</w:t>
+            </w:r>
+          </w:p>
+        </w:tc>
+        <w:tc>
+          <w:tcPr>
+            <w:tcW w:type="dxa" w:w="1250"/>
+            <w:tcBorders>
+              <w:top w:val="single" w:color="000000" w:sz="4"/>
+              <w:left w:val="single" w:color="000000" w:sz="4"/>
+              <w:bottom w:val="single" w:color="000000" w:sz="4"/>
+              <w:right w:val="single" w:color="000000" w:sz="4"/>
+            </w:tcBorders>
+            <w:tcMar>
+              <w:top w:type="dxa" w:w="60"/>
+              <w:left w:type="dxa" w:w="100"/>
+              <w:bottom w:type="dxa" w:w="60"/>
+              <w:right w:type="dxa" w:w="100"/>
+            </w:tcMar>
+          </w:tcPr>
+          <w:p>
+            <w:pPr>
+              <w:spacing w:line="276"/>
+              <w:jc w:val="left"/>
+            </w:pPr>
+            <w:r>
+              <w:rPr>
+                <w:rFonts w:ascii="Times New Roman" w:cs="Times New Roman" w:eastAsia="Times New Roman" w:hAnsi="Times New Roman"/>
+                <w:b w:val="false"/>
+                <w:bCs w:val="false"/>
+                <w:sz w:val="24"/>
+                <w:szCs w:val="24"/>
+              </w:rPr>
+              <w:t xml:space="preserve">11.98</w:t>
+            </w:r>
+          </w:p>
+        </w:tc>
+        <w:tc>
+          <w:tcPr>
+            <w:tcW w:type="dxa" w:w="1250"/>
+            <w:tcBorders>
+              <w:top w:val="single" w:color="000000" w:sz="4"/>
+              <w:left w:val="single" w:color="000000" w:sz="4"/>
+              <w:bottom w:val="single" w:color="000000" w:sz="4"/>
+              <w:right w:val="single" w:color="000000" w:sz="4"/>
+            </w:tcBorders>
+            <w:tcMar>
+              <w:top w:type="dxa" w:w="60"/>
+              <w:left w:type="dxa" w:w="100"/>
+              <w:bottom w:type="dxa" w:w="60"/>
+              <w:right w:type="dxa" w:w="100"/>
+            </w:tcMar>
+          </w:tcPr>
+          <w:p>
+            <w:pPr>
+              <w:spacing w:line="276"/>
+              <w:jc w:val="left"/>
+            </w:pPr>
+            <w:r>
+              <w:rPr>
+                <w:rFonts w:ascii="Times New Roman" w:cs="Times New Roman" w:eastAsia="Times New Roman" w:hAnsi="Times New Roman"/>
+                <w:b w:val="false"/>
+                <w:bCs w:val="false"/>
+                <w:sz w:val="24"/>
+                <w:szCs w:val="24"/>
+              </w:rPr>
+              <w:t xml:space="preserve">none</w:t>
+            </w:r>
+          </w:p>
+        </w:tc>
+        <w:tc>
+          <w:tcPr>
+            <w:tcW w:type="dxa" w:w="1250"/>
+            <w:tcBorders>
+              <w:top w:val="single" w:color="000000" w:sz="4"/>
+              <w:left w:val="single" w:color="000000" w:sz="4"/>
+              <w:bottom w:val="single" w:color="000000" w:sz="4"/>
+              <w:right w:val="single" w:color="000000" w:sz="4"/>
+            </w:tcBorders>
+            <w:tcMar>
+              <w:top w:type="dxa" w:w="60"/>
+              <w:left w:type="dxa" w:w="100"/>
+              <w:bottom w:type="dxa" w:w="60"/>
+              <w:right w:type="dxa" w:w="100"/>
+            </w:tcMar>
+          </w:tcPr>
+          <w:p>
+            <w:pPr>
+              <w:spacing w:line="276"/>
+              <w:jc w:val="left"/>
+            </w:pPr>
+            <w:r>
+              <w:rPr>
+                <w:rFonts w:ascii="Times New Roman" w:cs="Times New Roman" w:eastAsia="Times New Roman" w:hAnsi="Times New Roman"/>
+                <w:b w:val="false"/>
+                <w:bCs w:val="false"/>
+                <w:sz w:val="24"/>
+                <w:szCs w:val="24"/>
+              </w:rPr>
+              <w:t xml:space="preserve">none</w:t>
+            </w:r>
+          </w:p>
+        </w:tc>
+        <w:tc>
+          <w:tcPr>
+            <w:tcW w:type="dxa" w:w="1926"/>
+            <w:tcBorders>
+              <w:top w:val="single" w:color="000000" w:sz="4"/>
+              <w:left w:val="single" w:color="000000" w:sz="4"/>
+              <w:bottom w:val="single" w:color="000000" w:sz="4"/>
+              <w:right w:val="single" w:color="000000" w:sz="4"/>
+            </w:tcBorders>
+            <w:tcMar>
+              <w:top w:type="dxa" w:w="60"/>
+              <w:left w:type="dxa" w:w="100"/>
+              <w:bottom w:type="dxa" w:w="60"/>
+              <w:right w:type="dxa" w:w="100"/>
+            </w:tcMar>
+          </w:tcPr>
+          <w:p>
+            <w:pPr>
+              <w:spacing w:line="276"/>
+              <w:jc w:val="left"/>
+            </w:pPr>
+            <w:r>
+              <w:rPr>
+                <w:rFonts w:ascii="Times New Roman" w:cs="Times New Roman" w:eastAsia="Times New Roman" w:hAnsi="Times New Roman"/>
+                <w:b w:val="false"/>
+                <w:bCs w:val="false"/>
+                <w:sz w:val="24"/>
+                <w:szCs w:val="24"/>
+              </w:rPr>
+              <w:t xml:space="preserve">none</w:t>
+            </w:r>
+          </w:p>
+        </w:tc>
+      </w:tr>
+      <w:tr>
+        <w:trPr>
+          <w:cantSplit/>
+          <w:tblHeader w:val="false"/>
+        </w:trPr>
+        <w:tc>
+          <w:tcPr>
+            <w:tcW w:type="dxa" w:w="1100"/>
+            <w:tcBorders>
+              <w:top w:val="single" w:color="000000" w:sz="4"/>
+              <w:left w:val="single" w:color="000000" w:sz="4"/>
+              <w:bottom w:val="single" w:color="000000" w:sz="4"/>
+              <w:right w:val="single" w:color="000000" w:sz="4"/>
+            </w:tcBorders>
+            <w:tcMar>
+              <w:top w:type="dxa" w:w="60"/>
+              <w:left w:type="dxa" w:w="100"/>
+              <w:bottom w:type="dxa" w:w="60"/>
+              <w:right w:type="dxa" w:w="100"/>
+            </w:tcMar>
+          </w:tcPr>
+          <w:p>
+            <w:pPr>
+              <w:spacing w:line="276"/>
+              <w:jc w:val="left"/>
+            </w:pPr>
+            <w:r>
+              <w:rPr>
+                <w:rFonts w:ascii="Times New Roman" w:cs="Times New Roman" w:eastAsia="Times New Roman" w:hAnsi="Times New Roman"/>
+                <w:b w:val="false"/>
+                <w:bCs w:val="false"/>
+                <w:sz w:val="24"/>
+                <w:szCs w:val="24"/>
+              </w:rPr>
+              <w:t xml:space="preserve">3</w:t>
+            </w:r>
+          </w:p>
+        </w:tc>
+        <w:tc>
+          <w:tcPr>
+            <w:tcW w:type="dxa" w:w="1250"/>
+            <w:tcBorders>
+              <w:top w:val="single" w:color="000000" w:sz="4"/>
+              <w:left w:val="single" w:color="000000" w:sz="4"/>
+              <w:bottom w:val="single" w:color="000000" w:sz="4"/>
+              <w:right w:val="single" w:color="000000" w:sz="4"/>
+            </w:tcBorders>
+            <w:tcMar>
+              <w:top w:type="dxa" w:w="60"/>
+              <w:left w:type="dxa" w:w="100"/>
+              <w:bottom w:type="dxa" w:w="60"/>
+              <w:right w:type="dxa" w:w="100"/>
+            </w:tcMar>
+          </w:tcPr>
+          <w:p>
+            <w:pPr>
+              <w:spacing w:line="276"/>
+              <w:jc w:val="left"/>
+            </w:pPr>
+            <w:r>
+              <w:rPr>
+                <w:rFonts w:ascii="Times New Roman" w:cs="Times New Roman" w:eastAsia="Times New Roman" w:hAnsi="Times New Roman"/>
+                <w:b w:val="false"/>
+                <w:bCs w:val="false"/>
+                <w:sz w:val="24"/>
+                <w:szCs w:val="24"/>
+              </w:rPr>
+              <w:t xml:space="preserve">39.27</w:t>
+            </w:r>
+          </w:p>
+        </w:tc>
+        <w:tc>
+          <w:tcPr>
+            <w:tcW w:type="dxa" w:w="1250"/>
+            <w:tcBorders>
+              <w:top w:val="single" w:color="000000" w:sz="4"/>
+              <w:left w:val="single" w:color="000000" w:sz="4"/>
+              <w:bottom w:val="single" w:color="000000" w:sz="4"/>
+              <w:right w:val="single" w:color="000000" w:sz="4"/>
+            </w:tcBorders>
+            <w:tcMar>
+              <w:top w:type="dxa" w:w="60"/>
+              <w:left w:type="dxa" w:w="100"/>
+              <w:bottom w:type="dxa" w:w="60"/>
+              <w:right w:type="dxa" w:w="100"/>
+            </w:tcMar>
+          </w:tcPr>
+          <w:p>
+            <w:pPr>
+              <w:spacing w:line="276"/>
+              <w:jc w:val="left"/>
+            </w:pPr>
+            <w:r>
+              <w:rPr>
+                <w:rFonts w:ascii="Times New Roman" w:cs="Times New Roman" w:eastAsia="Times New Roman" w:hAnsi="Times New Roman"/>
+                <w:b w:val="false"/>
+                <w:bCs w:val="false"/>
+                <w:sz w:val="24"/>
+                <w:szCs w:val="24"/>
+              </w:rPr>
+              <w:t xml:space="preserve">none</w:t>
+            </w:r>
+          </w:p>
+        </w:tc>
+        <w:tc>
+          <w:tcPr>
+            <w:tcW w:type="dxa" w:w="1250"/>
+            <w:tcBorders>
+              <w:top w:val="single" w:color="000000" w:sz="4"/>
+              <w:left w:val="single" w:color="000000" w:sz="4"/>
+              <w:bottom w:val="single" w:color="000000" w:sz="4"/>
+              <w:right w:val="single" w:color="000000" w:sz="4"/>
+            </w:tcBorders>
+            <w:tcMar>
+              <w:top w:type="dxa" w:w="60"/>
+              <w:left w:type="dxa" w:w="100"/>
+              <w:bottom w:type="dxa" w:w="60"/>
+              <w:right w:type="dxa" w:w="100"/>
+            </w:tcMar>
+          </w:tcPr>
+          <w:p>
+            <w:pPr>
+              <w:spacing w:line="276"/>
+              <w:jc w:val="left"/>
+            </w:pPr>
+            <w:r>
+              <w:rPr>
+                <w:rFonts w:ascii="Times New Roman" w:cs="Times New Roman" w:eastAsia="Times New Roman" w:hAnsi="Times New Roman"/>
+                <w:b w:val="false"/>
+                <w:bCs w:val="false"/>
+                <w:sz w:val="24"/>
+                <w:szCs w:val="24"/>
+              </w:rPr>
+              <w:t xml:space="preserve">240.42</w:t>
+            </w:r>
+          </w:p>
+        </w:tc>
+        <w:tc>
+          <w:tcPr>
+            <w:tcW w:type="dxa" w:w="1250"/>
+            <w:tcBorders>
+              <w:top w:val="single" w:color="000000" w:sz="4"/>
+              <w:left w:val="single" w:color="000000" w:sz="4"/>
+              <w:bottom w:val="single" w:color="000000" w:sz="4"/>
+              <w:right w:val="single" w:color="000000" w:sz="4"/>
+            </w:tcBorders>
+            <w:tcMar>
+              <w:top w:type="dxa" w:w="60"/>
+              <w:left w:type="dxa" w:w="100"/>
+              <w:bottom w:type="dxa" w:w="60"/>
+              <w:right w:type="dxa" w:w="100"/>
+            </w:tcMar>
+          </w:tcPr>
+          <w:p>
+            <w:pPr>
+              <w:spacing w:line="276"/>
+              <w:jc w:val="left"/>
+            </w:pPr>
+            <w:r>
+              <w:rPr>
+                <w:rFonts w:ascii="Times New Roman" w:cs="Times New Roman" w:eastAsia="Times New Roman" w:hAnsi="Times New Roman"/>
+                <w:b w:val="false"/>
+                <w:bCs w:val="false"/>
+                <w:sz w:val="24"/>
+                <w:szCs w:val="24"/>
+              </w:rPr>
+              <w:t xml:space="preserve">53.37</w:t>
+            </w:r>
+          </w:p>
+        </w:tc>
+        <w:tc>
+          <w:tcPr>
+            <w:tcW w:type="dxa" w:w="1926"/>
+            <w:tcBorders>
+              <w:top w:val="single" w:color="000000" w:sz="4"/>
+              <w:left w:val="single" w:color="000000" w:sz="4"/>
+              <w:bottom w:val="single" w:color="000000" w:sz="4"/>
+              <w:right w:val="single" w:color="000000" w:sz="4"/>
+            </w:tcBorders>
+            <w:tcMar>
+              <w:top w:type="dxa" w:w="60"/>
+              <w:left w:type="dxa" w:w="100"/>
+              <w:bottom w:type="dxa" w:w="60"/>
+              <w:right w:type="dxa" w:w="100"/>
+            </w:tcMar>
+          </w:tcPr>
+          <w:p>
+            <w:pPr>
+              <w:spacing w:line="276"/>
+              <w:jc w:val="left"/>
+            </w:pPr>
+            <w:r>
+              <w:rPr>
+                <w:rFonts w:ascii="Times New Roman" w:cs="Times New Roman" w:eastAsia="Times New Roman" w:hAnsi="Times New Roman"/>
+                <w:b w:val="false"/>
+                <w:bCs w:val="false"/>
+                <w:sz w:val="24"/>
+                <w:szCs w:val="24"/>
+              </w:rPr>
+              <w:t xml:space="preserve">70.56</w:t>
+            </w:r>
+          </w:p>
+        </w:tc>
+      </w:tr>
+      <w:tr>
+        <w:trPr>
+          <w:cantSplit/>
+          <w:tblHeader w:val="false"/>
+        </w:trPr>
+        <w:tc>
+          <w:tcPr>
+            <w:tcW w:type="dxa" w:w="1100"/>
+            <w:tcBorders>
+              <w:top w:val="single" w:color="000000" w:sz="4"/>
+              <w:left w:val="single" w:color="000000" w:sz="4"/>
+              <w:bottom w:val="single" w:color="000000" w:sz="4"/>
+              <w:right w:val="single" w:color="000000" w:sz="4"/>
+            </w:tcBorders>
+            <w:tcMar>
+              <w:top w:type="dxa" w:w="60"/>
+              <w:left w:type="dxa" w:w="100"/>
+              <w:bottom w:type="dxa" w:w="60"/>
+              <w:right w:type="dxa" w:w="100"/>
+            </w:tcMar>
+          </w:tcPr>
+          <w:p>
+            <w:pPr>
+              <w:spacing w:line="276"/>
+              <w:jc w:val="left"/>
+            </w:pPr>
+            <w:r>
+              <w:rPr>
+                <w:rFonts w:ascii="Times New Roman" w:cs="Times New Roman" w:eastAsia="Times New Roman" w:hAnsi="Times New Roman"/>
+                <w:b w:val="false"/>
+                <w:bCs w:val="false"/>
+                <w:sz w:val="24"/>
+                <w:szCs w:val="24"/>
+              </w:rPr>
+              <w:t xml:space="preserve">4</w:t>
+            </w:r>
+          </w:p>
+        </w:tc>
+        <w:tc>
+          <w:tcPr>
+            <w:tcW w:type="dxa" w:w="1250"/>
+            <w:tcBorders>
+              <w:top w:val="single" w:color="000000" w:sz="4"/>
+              <w:left w:val="single" w:color="000000" w:sz="4"/>
+              <w:bottom w:val="single" w:color="000000" w:sz="4"/>
+              <w:right w:val="single" w:color="000000" w:sz="4"/>
+            </w:tcBorders>
+            <w:tcMar>
+              <w:top w:type="dxa" w:w="60"/>
+              <w:left w:type="dxa" w:w="100"/>
+              <w:bottom w:type="dxa" w:w="60"/>
+              <w:right w:type="dxa" w:w="100"/>
+            </w:tcMar>
+          </w:tcPr>
+          <w:p>
+            <w:pPr>
+              <w:spacing w:line="276"/>
+              <w:jc w:val="left"/>
+            </w:pPr>
+            <w:r>
+              <w:rPr>
+                <w:rFonts w:ascii="Times New Roman" w:cs="Times New Roman" w:eastAsia="Times New Roman" w:hAnsi="Times New Roman"/>
+                <w:b w:val="false"/>
+                <w:bCs w:val="false"/>
+                <w:sz w:val="24"/>
+                <w:szCs w:val="24"/>
+              </w:rPr>
+              <w:t xml:space="preserve">11.37</w:t>
+            </w:r>
+          </w:p>
+        </w:tc>
+        <w:tc>
+          <w:tcPr>
+            <w:tcW w:type="dxa" w:w="1250"/>
+            <w:tcBorders>
+              <w:top w:val="single" w:color="000000" w:sz="4"/>
+              <w:left w:val="single" w:color="000000" w:sz="4"/>
+              <w:bottom w:val="single" w:color="000000" w:sz="4"/>
+              <w:right w:val="single" w:color="000000" w:sz="4"/>
+            </w:tcBorders>
+            <w:tcMar>
+              <w:top w:type="dxa" w:w="60"/>
+              <w:left w:type="dxa" w:w="100"/>
+              <w:bottom w:type="dxa" w:w="60"/>
+              <w:right w:type="dxa" w:w="100"/>
+            </w:tcMar>
+          </w:tcPr>
+          <w:p>
+            <w:pPr>
+              <w:spacing w:line="276"/>
+              <w:jc w:val="left"/>
+            </w:pPr>
+            <w:r>
+              <w:rPr>
+                <w:rFonts w:ascii="Times New Roman" w:cs="Times New Roman" w:eastAsia="Times New Roman" w:hAnsi="Times New Roman"/>
+                <w:b w:val="false"/>
+                <w:bCs w:val="false"/>
+                <w:sz w:val="24"/>
+                <w:szCs w:val="24"/>
+              </w:rPr>
+              <w:t xml:space="preserve">86.95</w:t>
+            </w:r>
+          </w:p>
+        </w:tc>
+        <w:tc>
+          <w:tcPr>
+            <w:tcW w:type="dxa" w:w="1250"/>
+            <w:tcBorders>
+              <w:top w:val="single" w:color="000000" w:sz="4"/>
+              <w:left w:val="single" w:color="000000" w:sz="4"/>
+              <w:bottom w:val="single" w:color="000000" w:sz="4"/>
+              <w:right w:val="single" w:color="000000" w:sz="4"/>
+            </w:tcBorders>
+            <w:tcMar>
+              <w:top w:type="dxa" w:w="60"/>
+              <w:left w:type="dxa" w:w="100"/>
+              <w:bottom w:type="dxa" w:w="60"/>
+              <w:right w:type="dxa" w:w="100"/>
+            </w:tcMar>
+          </w:tcPr>
+          <w:p>
+            <w:pPr>
+              <w:spacing w:line="276"/>
+              <w:jc w:val="left"/>
+            </w:pPr>
+            <w:r>
+              <w:rPr>
+                <w:rFonts w:ascii="Times New Roman" w:cs="Times New Roman" w:eastAsia="Times New Roman" w:hAnsi="Times New Roman"/>
+                <w:b w:val="false"/>
+                <w:bCs w:val="false"/>
+                <w:sz w:val="24"/>
+                <w:szCs w:val="24"/>
+              </w:rPr>
+              <w:t xml:space="preserve">218.17</w:t>
+            </w:r>
+          </w:p>
+        </w:tc>
+        <w:tc>
+          <w:tcPr>
+            <w:tcW w:type="dxa" w:w="1250"/>
+            <w:tcBorders>
+              <w:top w:val="single" w:color="000000" w:sz="4"/>
+              <w:left w:val="single" w:color="000000" w:sz="4"/>
+              <w:bottom w:val="single" w:color="000000" w:sz="4"/>
+              <w:right w:val="single" w:color="000000" w:sz="4"/>
+            </w:tcBorders>
+            <w:tcMar>
+              <w:top w:type="dxa" w:w="60"/>
+              <w:left w:type="dxa" w:w="100"/>
+              <w:bottom w:type="dxa" w:w="60"/>
+              <w:right w:type="dxa" w:w="100"/>
+            </w:tcMar>
+          </w:tcPr>
+          <w:p>
+            <w:pPr>
+              <w:spacing w:line="276"/>
+              <w:jc w:val="left"/>
+            </w:pPr>
+            <w:r>
+              <w:rPr>
+                <w:rFonts w:ascii="Times New Roman" w:cs="Times New Roman" w:eastAsia="Times New Roman" w:hAnsi="Times New Roman"/>
+                <w:b w:val="false"/>
+                <w:bCs w:val="false"/>
+                <w:sz w:val="24"/>
+                <w:szCs w:val="24"/>
+              </w:rPr>
+              <w:t xml:space="preserve">68.90</w:t>
+            </w:r>
+          </w:p>
+        </w:tc>
+        <w:tc>
+          <w:tcPr>
+            <w:tcW w:type="dxa" w:w="1926"/>
+            <w:tcBorders>
+              <w:top w:val="single" w:color="000000" w:sz="4"/>
+              <w:left w:val="single" w:color="000000" w:sz="4"/>
+              <w:bottom w:val="single" w:color="000000" w:sz="4"/>
+              <w:right w:val="single" w:color="000000" w:sz="4"/>
+            </w:tcBorders>
+            <w:tcMar>
+              <w:top w:type="dxa" w:w="60"/>
+              <w:left w:type="dxa" w:w="100"/>
+              <w:bottom w:type="dxa" w:w="60"/>
+              <w:right w:type="dxa" w:w="100"/>
+            </w:tcMar>
+          </w:tcPr>
+          <w:p>
+            <w:pPr>
+              <w:spacing w:line="276"/>
+              <w:jc w:val="left"/>
+            </w:pPr>
+            <w:r>
+              <w:rPr>
+                <w:rFonts w:ascii="Times New Roman" w:cs="Times New Roman" w:eastAsia="Times New Roman" w:hAnsi="Times New Roman"/>
+                <w:b w:val="false"/>
+                <w:bCs w:val="false"/>
+                <w:sz w:val="24"/>
+                <w:szCs w:val="24"/>
+              </w:rPr>
+              <w:t xml:space="preserve">110.81</w:t>
+            </w:r>
+          </w:p>
+        </w:tc>
+      </w:tr>
+      <w:tr>
+        <w:trPr>
+          <w:cantSplit/>
+          <w:tblHeader w:val="false"/>
+        </w:trPr>
+        <w:tc>
+          <w:tcPr>
+            <w:tcW w:type="dxa" w:w="1100"/>
+            <w:tcBorders>
+              <w:top w:val="single" w:color="000000" w:sz="4"/>
+              <w:left w:val="single" w:color="000000" w:sz="4"/>
+              <w:bottom w:val="single" w:color="000000" w:sz="4"/>
+              <w:right w:val="single" w:color="000000" w:sz="4"/>
+            </w:tcBorders>
+            <w:tcMar>
+              <w:top w:type="dxa" w:w="60"/>
+              <w:left w:type="dxa" w:w="100"/>
+              <w:bottom w:type="dxa" w:w="60"/>
+              <w:right w:type="dxa" w:w="100"/>
+            </w:tcMar>
+          </w:tcPr>
+          <w:p>
+            <w:pPr>
+              <w:spacing w:line="276"/>
+              <w:jc w:val="left"/>
+            </w:pPr>
+            <w:r>
+              <w:rPr>
+                <w:rFonts w:ascii="Times New Roman" w:cs="Times New Roman" w:eastAsia="Times New Roman" w:hAnsi="Times New Roman"/>
+                <w:b w:val="false"/>
+                <w:bCs w:val="false"/>
+                <w:sz w:val="24"/>
+                <w:szCs w:val="24"/>
+              </w:rPr>
+              <w:t xml:space="preserve">5</w:t>
+            </w:r>
+          </w:p>
+        </w:tc>
+        <w:tc>
+          <w:tcPr>
+            <w:tcW w:type="dxa" w:w="1250"/>
+            <w:tcBorders>
+              <w:top w:val="single" w:color="000000" w:sz="4"/>
+              <w:left w:val="single" w:color="000000" w:sz="4"/>
+              <w:bottom w:val="single" w:color="000000" w:sz="4"/>
+              <w:right w:val="single" w:color="000000" w:sz="4"/>
+            </w:tcBorders>
+            <w:tcMar>
+              <w:top w:type="dxa" w:w="60"/>
+              <w:left w:type="dxa" w:w="100"/>
+              <w:bottom w:type="dxa" w:w="60"/>
+              <w:right w:type="dxa" w:w="100"/>
+            </w:tcMar>
+          </w:tcPr>
+          <w:p>
+            <w:pPr>
+              <w:spacing w:line="276"/>
+              <w:jc w:val="left"/>
+            </w:pPr>
+            <w:r>
+              <w:rPr>
+                <w:rFonts w:ascii="Times New Roman" w:cs="Times New Roman" w:eastAsia="Times New Roman" w:hAnsi="Times New Roman"/>
+                <w:b w:val="false"/>
+                <w:bCs w:val="false"/>
+                <w:sz w:val="24"/>
+                <w:szCs w:val="24"/>
+              </w:rPr>
+              <w:t xml:space="preserve">50.89</w:t>
+            </w:r>
+          </w:p>
+        </w:tc>
+        <w:tc>
+          <w:tcPr>
+            <w:tcW w:type="dxa" w:w="1250"/>
+            <w:tcBorders>
+              <w:top w:val="single" w:color="000000" w:sz="4"/>
+              <w:left w:val="single" w:color="000000" w:sz="4"/>
+              <w:bottom w:val="single" w:color="000000" w:sz="4"/>
+              <w:right w:val="single" w:color="000000" w:sz="4"/>
+            </w:tcBorders>
+            <w:tcMar>
+              <w:top w:type="dxa" w:w="60"/>
+              <w:left w:type="dxa" w:w="100"/>
+              <w:bottom w:type="dxa" w:w="60"/>
+              <w:right w:type="dxa" w:w="100"/>
+            </w:tcMar>
+          </w:tcPr>
+          <w:p>
+            <w:pPr>
+              <w:spacing w:line="276"/>
+              <w:jc w:val="left"/>
+            </w:pPr>
+            <w:r>
+              <w:rPr>
+                <w:rFonts w:ascii="Times New Roman" w:cs="Times New Roman" w:eastAsia="Times New Roman" w:hAnsi="Times New Roman"/>
+                <w:b w:val="false"/>
+                <w:bCs w:val="false"/>
+                <w:sz w:val="24"/>
+                <w:szCs w:val="24"/>
+              </w:rPr>
+              <w:t xml:space="preserve">143.13</w:t>
+            </w:r>
+          </w:p>
+        </w:tc>
+        <w:tc>
+          <w:tcPr>
+            <w:tcW w:type="dxa" w:w="1250"/>
+            <w:tcBorders>
+              <w:top w:val="single" w:color="000000" w:sz="4"/>
+              <w:left w:val="single" w:color="000000" w:sz="4"/>
+              <w:bottom w:val="single" w:color="000000" w:sz="4"/>
+              <w:right w:val="single" w:color="000000" w:sz="4"/>
+            </w:tcBorders>
+            <w:tcMar>
+              <w:top w:type="dxa" w:w="60"/>
+              <w:left w:type="dxa" w:w="100"/>
+              <w:bottom w:type="dxa" w:w="60"/>
+              <w:right w:type="dxa" w:w="100"/>
+            </w:tcMar>
+          </w:tcPr>
+          <w:p>
+            <w:pPr>
+              <w:spacing w:line="276"/>
+              <w:jc w:val="left"/>
+            </w:pPr>
+            <w:r>
+              <w:rPr>
+                <w:rFonts w:ascii="Times New Roman" w:cs="Times New Roman" w:eastAsia="Times New Roman" w:hAnsi="Times New Roman"/>
+                <w:b w:val="false"/>
+                <w:bCs w:val="false"/>
+                <w:sz w:val="24"/>
+                <w:szCs w:val="24"/>
+              </w:rPr>
+              <w:t xml:space="preserve">167.07</w:t>
+            </w:r>
+          </w:p>
+        </w:tc>
+        <w:tc>
+          <w:tcPr>
+            <w:tcW w:type="dxa" w:w="1250"/>
+            <w:tcBorders>
+              <w:top w:val="single" w:color="000000" w:sz="4"/>
+              <w:left w:val="single" w:color="000000" w:sz="4"/>
+              <w:bottom w:val="single" w:color="000000" w:sz="4"/>
+              <w:right w:val="single" w:color="000000" w:sz="4"/>
+            </w:tcBorders>
+            <w:tcMar>
+              <w:top w:type="dxa" w:w="60"/>
+              <w:left w:type="dxa" w:w="100"/>
+              <w:bottom w:type="dxa" w:w="60"/>
+              <w:right w:type="dxa" w:w="100"/>
+            </w:tcMar>
+          </w:tcPr>
+          <w:p>
+            <w:pPr>
+              <w:spacing w:line="276"/>
+              <w:jc w:val="left"/>
+            </w:pPr>
+            <w:r>
+              <w:rPr>
+                <w:rFonts w:ascii="Times New Roman" w:cs="Times New Roman" w:eastAsia="Times New Roman" w:hAnsi="Times New Roman"/>
+                <w:b w:val="false"/>
+                <w:bCs w:val="false"/>
+                <w:sz w:val="24"/>
+                <w:szCs w:val="24"/>
+              </w:rPr>
+              <w:t xml:space="preserve">43.53</w:t>
+            </w:r>
+          </w:p>
+        </w:tc>
+        <w:tc>
+          <w:tcPr>
+            <w:tcW w:type="dxa" w:w="1926"/>
+            <w:tcBorders>
+              <w:top w:val="single" w:color="000000" w:sz="4"/>
+              <w:left w:val="single" w:color="000000" w:sz="4"/>
+              <w:bottom w:val="single" w:color="000000" w:sz="4"/>
+              <w:right w:val="single" w:color="000000" w:sz="4"/>
+            </w:tcBorders>
+            <w:tcMar>
+              <w:top w:type="dxa" w:w="60"/>
+              <w:left w:type="dxa" w:w="100"/>
+              <w:bottom w:type="dxa" w:w="60"/>
+              <w:right w:type="dxa" w:w="100"/>
+            </w:tcMar>
+          </w:tcPr>
+          <w:p>
+            <w:pPr>
+              <w:spacing w:line="276"/>
+              <w:jc w:val="left"/>
+            </w:pPr>
+            <w:r>
+              <w:rPr>
+                <w:rFonts w:ascii="Times New Roman" w:cs="Times New Roman" w:eastAsia="Times New Roman" w:hAnsi="Times New Roman"/>
+                <w:b w:val="false"/>
+                <w:bCs w:val="false"/>
+                <w:sz w:val="24"/>
+                <w:szCs w:val="24"/>
+              </w:rPr>
+              <w:t xml:space="preserve">32.01</w:t>
+            </w:r>
+          </w:p>
+        </w:tc>
+      </w:tr>
+    </w:tbl>
+    <w:p>
+      <w:pPr>
+        <w:spacing w:after="160"/>
+      </w:pPr>
+    </w:p>
+    <w:p>
+      <w:pPr>
+        <w:spacing w:after="120" w:line="360"/>
+        <w:jc w:val="both"/>
+      </w:pPr>
+      <w:r>
+        <w:rPr>
+          <w:rFonts w:ascii="Times New Roman" w:cs="Times New Roman" w:eastAsia="Times New Roman" w:hAnsi="Times New Roman"/>
+          <w:b/>
+          <w:bCs/>
+          <w:sz w:val="24"/>
+          <w:szCs w:val="24"/>
+        </w:rPr>
+        <w:t xml:space="preserve">RUDP works between real machines, and this run does not rank the policies.</w:t>
+      </w:r>
+      <w:r>
+        <w:rPr>
+          <w:rFonts w:ascii="Times New Roman" w:cs="Times New Roman" w:eastAsia="Times New Roman" w:hAnsi="Times New Roman"/>
+          <w:sz w:val="24"/>
+          <w:szCs w:val="24"/>
+        </w:rPr>
+        <w:t xml:space="preserve"> In all 16 completed RUDP transfers all 4,000 packets were delivered. The path was not stable: kernel TCP alone took between 2.0 and 50.9 s and the round-trip time of the RUDP flows rose from about 82 ms to between 160 and 490 ms in repetitions 3 to 5, so conditions changed from one transfer to the next. Four of the 20 RUDP transfers produced no result (three in a row in repetition 2, one in repetition 3); the cause is not known, either a break in the relayed path or a server still occupied by a transfer that had been stopped. On the two repetitions with a usable path, kernel TCP was 2 to 6 times faster than any RUDP policy, as in Section 8.17, and in repetition 1 the neural agent (4.70 s) finished before tuned AIMD (14.23 s) and the BBR-style controller (6.35 s). In the degraded repetitions the neural agent was faster than tuned AIMD in one (32.0 against 143.1 s) and slower in another (110.8 against 86.9 s), and slower than the BBR-style controller in two of three. With five repetitions, four missing cells and a drifting path no intervals or significance tests are reported. The original result file stayed on the client laptop, which was no longer reachable; the table was transcribed from the terminal output of the run (results/multihost_summary.txt). A repeat on a direct local-network path with more repetitions is the obvious next step.</w:t>
       </w:r>
     </w:p>
     <w:p>
@@ -47904,7 +49232,7 @@
           <w:sz w:val="24"/>
           <w:szCs w:val="24"/>
         </w:rPr>
-        <w:t xml:space="preserve"> The path is emulated in the client process, in a user-space proxy on the loopback interface, or in virtual time. These agree with each other. The comparison was repeated once on kernel tc/netem over loopback on one laptop (Section 8.17, five runs per cell), where kernel TCP is faster than the neural agent on every path; no physical link or multi-machine path was tested.</w:t>
+        <w:t xml:space="preserve"> The path is emulated in the client process, in a user-space proxy on the loopback interface, or in virtual time. These agree with each other. The comparison was repeated once on kernel tc/netem over loopback on one laptop (Section 8.17, five runs per cell), where kernel TCP is faster than the neural agent on every path; one first run between two laptops over a relayed internet path (Section 8.23) showed that RUDP works between machines but is too noisy to rank the policies; no controlled physical link was tested.</w:t>
       </w:r>
     </w:p>
     <w:p>

</xml_diff>